<commit_message>
task-V1.06: adopt nPM1300 coulomb-counter SOC (protocol V0.4)
- percent algorithm frozen: NCS nrf_fuel_gauge lib (coulomb counter + battery model via nPM PowerUP profiling), ref sample nrf/samples/pmic/native/npm13xx_fuel_gauge; frame format unchanged, voltage-linear mapping kept as pre-calibration fallback

- spec md V0.4: open item #7 closed, new firmware module src/hardware/batt_gauge.c/h planned (CONFIG_APP_BATT_GAUGE)

- demo GUI: battery sim inverted to SOC semantics - SOC as integrated state variable, voltage reverse-looked-up from piecewise Li-ion OCV curve (plateau ~3.78V@50%)
</commit_message>
<xml_diff>
--- a/docs/宠物环传感器控制_通信协议.docx
+++ b/docs/宠物环传感器控制_通信协议.docx
@@ -113,7 +113,7 @@
               <w:spacing w:line="240" w:lineRule="auto" w:before="60" w:after="60"/>
             </w:pPr>
             <w:r>
-              <w:t>V0.3</w:t>
+              <w:t>V0.4</w:t>
             </w:r>
             <w:r>
               <w:t xml:space="preserve"> </w:t>
@@ -1205,6 +1205,186 @@
             </w:r>
             <w:r>
               <w:t>电池监测时序</w:t>
+            </w:r>
+          </w:p>
+        </w:tc>
+      </w:tr>
+      <w:tr>
+        <w:tc>
+          <w:tcPr>
+            <w:tcW w:type="dxa" w:w="2160"/>
+            <w:shd w:fill="E8F6EF" w:val="clear" w:color="auto"/>
+            <w:vAlign w:val="center"/>
+            <w:tcBorders>
+              <w:top w:val="single" w:sz="6" w:space="0" w:color="B8C9D6"/>
+              <w:bottom w:val="single" w:sz="6" w:space="0" w:color="B8C9D6"/>
+              <w:left w:val="single" w:sz="18" w:space="0" w:color="117A4F"/>
+              <w:right w:val="single" w:sz="6" w:space="0" w:color="B8C9D6"/>
+            </w:tcBorders>
+            <w:tcMar>
+              <w:top w:w="90" w:type="dxa"/>
+              <w:bottom w:w="90" w:type="dxa"/>
+              <w:left w:w="135" w:type="dxa"/>
+              <w:right w:w="135" w:type="dxa"/>
+            </w:tcMar>
+          </w:tcPr>
+          <w:p>
+            <w:pPr>
+              <w:spacing w:line="240" w:lineRule="auto" w:before="60" w:after="60"/>
+            </w:pPr>
+            <w:r>
+              <w:rPr>
+                <w:b/>
+                <w:color w:val="117A4F"/>
+              </w:rPr>
+              <w:t>V0.4</w:t>
+            </w:r>
+          </w:p>
+        </w:tc>
+        <w:tc>
+          <w:tcPr>
+            <w:tcW w:type="dxa" w:w="2160"/>
+            <w:shd w:fill="E8F6EF" w:val="clear" w:color="auto"/>
+            <w:vAlign w:val="center"/>
+            <w:tcBorders>
+              <w:top w:val="single" w:sz="6" w:space="0" w:color="B8C9D6"/>
+              <w:bottom w:val="single" w:sz="6" w:space="0" w:color="B8C9D6"/>
+              <w:left w:val="single" w:sz="6" w:space="0" w:color="B8C9D6"/>
+              <w:right w:val="single" w:sz="6" w:space="0" w:color="B8C9D6"/>
+            </w:tcBorders>
+            <w:tcMar>
+              <w:top w:w="90" w:type="dxa"/>
+              <w:bottom w:w="90" w:type="dxa"/>
+              <w:left w:w="135" w:type="dxa"/>
+              <w:right w:w="135" w:type="dxa"/>
+            </w:tcMar>
+          </w:tcPr>
+          <w:p>
+            <w:pPr>
+              <w:spacing w:line="240" w:lineRule="auto" w:before="60" w:after="60"/>
+            </w:pPr>
+            <w:r>
+              <w:t>2026-10-02</w:t>
+            </w:r>
+          </w:p>
+        </w:tc>
+        <w:tc>
+          <w:tcPr>
+            <w:tcW w:type="dxa" w:w="2160"/>
+            <w:shd w:fill="E8F6EF" w:val="clear" w:color="auto"/>
+            <w:vAlign w:val="center"/>
+            <w:tcBorders>
+              <w:top w:val="single" w:sz="6" w:space="0" w:color="B8C9D6"/>
+              <w:bottom w:val="single" w:sz="6" w:space="0" w:color="B8C9D6"/>
+              <w:left w:val="single" w:sz="6" w:space="0" w:color="B8C9D6"/>
+              <w:right w:val="single" w:sz="6" w:space="0" w:color="B8C9D6"/>
+            </w:tcBorders>
+            <w:tcMar>
+              <w:top w:w="90" w:type="dxa"/>
+              <w:bottom w:w="90" w:type="dxa"/>
+              <w:left w:w="135" w:type="dxa"/>
+              <w:right w:w="135" w:type="dxa"/>
+            </w:tcMar>
+          </w:tcPr>
+          <w:p>
+            <w:pPr>
+              <w:spacing w:line="240" w:lineRule="auto" w:before="60" w:after="60"/>
+            </w:pPr>
+            <w:r>
+              <w:t>研发组</w:t>
+            </w:r>
+          </w:p>
+        </w:tc>
+        <w:tc>
+          <w:tcPr>
+            <w:tcW w:type="dxa" w:w="2160"/>
+            <w:shd w:fill="E8F6EF" w:val="clear" w:color="auto"/>
+            <w:vAlign w:val="center"/>
+            <w:tcBorders>
+              <w:top w:val="single" w:sz="6" w:space="0" w:color="B8C9D6"/>
+              <w:bottom w:val="single" w:sz="6" w:space="0" w:color="B8C9D6"/>
+              <w:left w:val="single" w:sz="6" w:space="0" w:color="B8C9D6"/>
+              <w:right w:val="single" w:sz="6" w:space="0" w:color="B8C9D6"/>
+            </w:tcBorders>
+            <w:tcMar>
+              <w:top w:w="90" w:type="dxa"/>
+              <w:bottom w:w="90" w:type="dxa"/>
+              <w:left w:w="135" w:type="dxa"/>
+              <w:right w:w="135" w:type="dxa"/>
+            </w:tcMar>
+          </w:tcPr>
+          <w:p>
+            <w:pPr>
+              <w:spacing w:line="240" w:lineRule="auto" w:before="60" w:after="60"/>
+            </w:pPr>
+            <w:r>
+              <w:t xml:space="preserve">percent </w:t>
+            </w:r>
+            <w:r>
+              <w:t xml:space="preserve"> </w:t>
+            </w:r>
+            <w:r>
+              <w:t>字段算法定为</w:t>
+            </w:r>
+            <w:r>
+              <w:t xml:space="preserve"> </w:t>
+            </w:r>
+            <w:r>
+              <w:t xml:space="preserve"> nPM1300 </w:t>
+            </w:r>
+            <w:r>
+              <w:t xml:space="preserve"> </w:t>
+            </w:r>
+            <w:r>
+              <w:t>库仑计</w:t>
+            </w:r>
+            <w:r>
+              <w:t xml:space="preserve"> </w:t>
+            </w:r>
+            <w:r>
+              <w:t xml:space="preserve"> SOC</w:t>
+            </w:r>
+            <w:r>
+              <w:t xml:space="preserve"> </w:t>
+            </w:r>
+            <w:r>
+              <w:t>（</w:t>
+            </w:r>
+            <w:r>
+              <w:t xml:space="preserve"> </w:t>
+            </w:r>
+            <w:r>
+              <w:t xml:space="preserve">NCS nrf_fuel_gauge </w:t>
+            </w:r>
+            <w:r>
+              <w:t xml:space="preserve"> </w:t>
+            </w:r>
+            <w:r>
+              <w:t>算法库</w:t>
+            </w:r>
+            <w:r>
+              <w:t xml:space="preserve"> </w:t>
+            </w:r>
+            <w:r>
+              <w:t xml:space="preserve"> + </w:t>
+            </w:r>
+            <w:r>
+              <w:t xml:space="preserve"> </w:t>
+            </w:r>
+            <w:r>
+              <w:t>电池模型，替代电压线性映射）；帧格式不变；固件实现路径明确为</w:t>
+            </w:r>
+            <w:r>
+              <w:t xml:space="preserve"> </w:t>
+            </w:r>
+            <w:r>
+              <w:t xml:space="preserve"> npm13xx_fuel_gauge sample </w:t>
+            </w:r>
+            <w:r>
+              <w:t xml:space="preserve"> </w:t>
+            </w:r>
+            <w:r>
+              <w:t>路线</w:t>
             </w:r>
           </w:p>
         </w:tc>
@@ -12069,7 +12249,19 @@
               <w:t xml:space="preserve"> </w:t>
             </w:r>
             <w:r>
-              <w:t>（线性映射，后续可换库仑计</w:t>
+              <w:t>（</w:t>
+            </w:r>
+            <w:r>
+              <w:t xml:space="preserve"> </w:t>
+            </w:r>
+            <w:r>
+              <w:t xml:space="preserve">nPM1300 </w:t>
+            </w:r>
+            <w:r>
+              <w:t xml:space="preserve"> </w:t>
+            </w:r>
+            <w:r>
+              <w:t>库仑计</w:t>
             </w:r>
             <w:r>
               <w:t xml:space="preserve"> </w:t>
@@ -12081,7 +12273,7 @@
               <w:t xml:space="preserve"> </w:t>
             </w:r>
             <w:r>
-              <w:t>）</w:t>
+              <w:t>，见下注）</w:t>
             </w:r>
           </w:p>
         </w:tc>
@@ -12284,44 +12476,166 @@
         <w:spacing w:before="60" w:after="60"/>
       </w:pPr>
       <w:r>
-        <w:t xml:space="preserve">percent </w:t>
+        <w:rPr>
+          <w:rFonts w:ascii="Microsoft YaHei" w:eastAsia="Microsoft YaHei" w:hAnsi="Microsoft YaHei" w:cs="Microsoft YaHei" w:hint="eastAsia"/>
+          <w:b/>
+          <w:lang w:eastAsia="zh-CN"/>
+        </w:rPr>
+        <w:t>percent 算法（V0.4 定稿）</w:t>
       </w:r>
       <w:r>
         <w:rPr>
           <w:rFonts w:ascii="Microsoft YaHei" w:eastAsia="Microsoft YaHei" w:hAnsi="Microsoft YaHei" w:cs="Microsoft YaHei" w:hint="eastAsia"/>
           <w:lang w:eastAsia="zh-CN"/>
         </w:rPr>
-        <w:t>首版用电压线性映射（</w:t>
-      </w:r>
-      <w:r>
-        <w:t>3300 mV=0%</w:t>
+        <w:t>：</w:t>
+      </w:r>
+      <w:r>
+        <w:t xml:space="preserve">nPM1300 </w:t>
       </w:r>
       <w:r>
         <w:rPr>
           <w:rFonts w:ascii="Microsoft YaHei" w:eastAsia="Microsoft YaHei" w:hAnsi="Microsoft YaHei" w:cs="Microsoft YaHei" w:hint="eastAsia"/>
           <w:lang w:eastAsia="zh-CN"/>
         </w:rPr>
-        <w:t>，</w:t>
-      </w:r>
-      <w:r>
-        <w:t>4200 mV=100%</w:t>
+        <w:t>库仑计</w:t>
+      </w:r>
+      <w:r>
+        <w:t xml:space="preserve"> SOC——NCS </w:t>
+      </w:r>
+      <w:r>
+        <w:rPr>
+          <w:rFonts w:ascii="Consolas" w:hAnsi="Consolas"/>
+          <w:color w:val="C0392B"/>
+          <w:sz w:val="19"/>
+          <w:shd w:val="clear" w:color="auto" w:fill="F5F7F8"/>
+        </w:rPr>
+        <w:t>nrf_fuel_gauge</w:t>
+      </w:r>
+      <w:r>
+        <w:t xml:space="preserve"> </w:t>
       </w:r>
       <w:r>
         <w:rPr>
           <w:rFonts w:ascii="Microsoft YaHei" w:eastAsia="Microsoft YaHei" w:hAnsi="Microsoft YaHei" w:cs="Microsoft YaHei" w:hint="eastAsia"/>
           <w:lang w:eastAsia="zh-CN"/>
         </w:rPr>
-        <w:t>）；</w:t>
-      </w:r>
-      <w:r>
-        <w:t xml:space="preserve">nPM1300 </w:t>
+        <w:t>算法库运行于</w:t>
+      </w:r>
+      <w:r>
+        <w:t xml:space="preserve"> nRF54L</w:t>
       </w:r>
       <w:r>
         <w:rPr>
           <w:rFonts w:ascii="Microsoft YaHei" w:eastAsia="Microsoft YaHei" w:hAnsi="Microsoft YaHei" w:cs="Microsoft YaHei" w:hint="eastAsia"/>
           <w:lang w:eastAsia="zh-CN"/>
         </w:rPr>
-        <w:t>库仑计启用后平滑切换，帧格式不变；</w:t>
+        <w:t>，融合</w:t>
+      </w:r>
+      <w:r>
+        <w:t xml:space="preserve"> nPM1300 </w:t>
+      </w:r>
+      <w:r>
+        <w:rPr>
+          <w:rFonts w:ascii="Microsoft YaHei" w:eastAsia="Microsoft YaHei" w:hAnsi="Microsoft YaHei" w:cs="Microsoft YaHei" w:hint="eastAsia"/>
+          <w:lang w:eastAsia="zh-CN"/>
+        </w:rPr>
+        <w:t>的</w:t>
+      </w:r>
+      <w:r>
+        <w:t xml:space="preserve"> VBAT/IBAT </w:t>
+      </w:r>
+      <w:r>
+        <w:rPr>
+          <w:rFonts w:ascii="Microsoft YaHei" w:eastAsia="Microsoft YaHei" w:hAnsi="Microsoft YaHei" w:cs="Microsoft YaHei" w:hint="eastAsia"/>
+          <w:lang w:eastAsia="zh-CN"/>
+        </w:rPr>
+        <w:t>实测与电池模型（参考</w:t>
+      </w:r>
+      <w:r>
+        <w:t xml:space="preserve"> </w:t>
+      </w:r>
+      <w:r>
+        <w:rPr>
+          <w:rFonts w:ascii="Consolas" w:hAnsi="Consolas"/>
+          <w:color w:val="C0392B"/>
+          <w:sz w:val="19"/>
+          <w:shd w:val="clear" w:color="auto" w:fill="F5F7F8"/>
+        </w:rPr>
+        <w:t>nrf/samples/pmic/native/npm13xx_fuel_gauge</w:t>
+      </w:r>
+      <w:r>
+        <w:rPr>
+          <w:rFonts w:ascii="Microsoft YaHei" w:eastAsia="Microsoft YaHei" w:hAnsi="Microsoft YaHei" w:cs="Microsoft YaHei" w:hint="eastAsia"/>
+          <w:lang w:eastAsia="zh-CN"/>
+        </w:rPr>
+        <w:t>）；电池模型需经</w:t>
+      </w:r>
+      <w:r>
+        <w:t xml:space="preserve"> nPM PowerUP </w:t>
+      </w:r>
+      <w:r>
+        <w:rPr>
+          <w:rFonts w:ascii="Microsoft YaHei" w:eastAsia="Microsoft YaHei" w:hAnsi="Microsoft YaHei" w:cs="Microsoft YaHei" w:hint="eastAsia"/>
+          <w:lang w:eastAsia="zh-CN"/>
+        </w:rPr>
+        <w:t>对实配电芯做充放电曲线标定生成；库仑计启用前允许以电压线性映射（</w:t>
+      </w:r>
+      <w:r>
+        <w:t>3300~4200 mV</w:t>
+      </w:r>
+      <w:r>
+        <w:rPr>
+          <w:rFonts w:ascii="Microsoft YaHei" w:eastAsia="Microsoft YaHei" w:hAnsi="Microsoft YaHei" w:cs="Microsoft YaHei" w:hint="eastAsia"/>
+          <w:lang w:eastAsia="zh-CN"/>
+        </w:rPr>
+        <w:t>）临时兜底，帧格式不变；</w:t>
+      </w:r>
+    </w:p>
+    <w:p>
+      <w:pPr>
+        <w:pStyle w:val="ListBullet"/>
+        <w:spacing w:before="60" w:after="60"/>
+      </w:pPr>
+      <w:r>
+        <w:t xml:space="preserve">vbat_mv </w:t>
+      </w:r>
+      <w:r>
+        <w:rPr>
+          <w:rFonts w:ascii="Microsoft YaHei" w:eastAsia="Microsoft YaHei" w:hAnsi="Microsoft YaHei" w:cs="Microsoft YaHei" w:hint="eastAsia"/>
+          <w:lang w:eastAsia="zh-CN"/>
+        </w:rPr>
+        <w:t>始终为</w:t>
+      </w:r>
+      <w:r>
+        <w:t xml:space="preserve"> nPM1300 </w:t>
+      </w:r>
+      <w:r>
+        <w:rPr>
+          <w:rFonts w:ascii="Microsoft YaHei" w:eastAsia="Microsoft YaHei" w:hAnsi="Microsoft YaHei" w:cs="Microsoft YaHei" w:hint="eastAsia"/>
+          <w:lang w:eastAsia="zh-CN"/>
+        </w:rPr>
+        <w:t>实测电压（不受</w:t>
+      </w:r>
+      <w:r>
+        <w:t xml:space="preserve"> SOC </w:t>
+      </w:r>
+      <w:r>
+        <w:rPr>
+          <w:rFonts w:ascii="Microsoft YaHei" w:eastAsia="Microsoft YaHei" w:hAnsi="Microsoft YaHei" w:cs="Microsoft YaHei" w:hint="eastAsia"/>
+          <w:lang w:eastAsia="zh-CN"/>
+        </w:rPr>
+        <w:t>算法影响），上位机可据此交叉观察</w:t>
+      </w:r>
+      <w:r>
+        <w:t xml:space="preserve"> SOC </w:t>
+      </w:r>
+      <w:r>
+        <w:rPr>
+          <w:rFonts w:ascii="Microsoft YaHei" w:eastAsia="Microsoft YaHei" w:hAnsi="Microsoft YaHei" w:cs="Microsoft YaHei" w:hint="eastAsia"/>
+          <w:lang w:eastAsia="zh-CN"/>
+        </w:rPr>
+        <w:t>与电压的一致性；</w:t>
       </w:r>
     </w:p>
     <w:p>

</xml_diff>